<commit_message>
june 23 (before ICC removal)
</commit_message>
<xml_diff>
--- a/Background/Notes on NTM.docx
+++ b/Background/Notes on NTM.docx
@@ -2022,6 +2022,28 @@
       <w:proofErr w:type="gramEnd"/>
       <w:r>
         <w:t xml:space="preserve"> of models and results (keep it concise)</w:t>
+      </w:r>
+    </w:p>
+    <w:p/>
+    <w:p>
+      <w:r>
+        <w:t xml:space="preserve">My thoughts for you to cut and paste for later: teach a little about the methods including explaining an interpretation of an odds ratio for the different models. Make a Table 1 </w:t>
+      </w:r>
+      <w:proofErr w:type="gramStart"/>
+      <w:r>
+        <w:t>averaged</w:t>
+      </w:r>
+      <w:proofErr w:type="gramEnd"/>
+      <w:r>
+        <w:t xml:space="preserve"> across </w:t>
+      </w:r>
+      <w:proofErr w:type="gramStart"/>
+      <w:r>
+        <w:t>raters</w:t>
+      </w:r>
+      <w:proofErr w:type="gramEnd"/>
+      <w:r>
+        <w:t xml:space="preserve"> or make some graphs of the raw data on percentages in each severity.  Include other measures of agreement from raters.</w:t>
       </w:r>
     </w:p>
     <w:sectPr>

</xml_diff>